<commit_message>
docs: update room in syllabus
</commit_message>
<xml_diff>
--- a/comp130-syllabus-1-19-2026.docx
+++ b/comp130-syllabus-1-19-2026.docx
@@ -810,7 +810,7 @@
           <w:sz w:val="22"/>
           <w:szCs w:val="22"/>
         </w:rPr>
-        <w:t>[room TBA, likely Tome 115]</w:t>
+        <w:t>Tome 115</w:t>
       </w:r>
     </w:p>
     <w:p>
@@ -919,15 +919,7 @@
           <w:sz w:val="22"/>
           <w:szCs w:val="22"/>
         </w:rPr>
-        <w:t xml:space="preserve">For John </w:t>
-      </w:r>
-      <w:proofErr w:type="spellStart"/>
-      <w:r>
-        <w:rPr>
-          <w:sz w:val="22"/>
-          <w:szCs w:val="22"/>
-        </w:rPr>
-        <w:t>Mac</w:t>
+        <w:t>For John Mac</w:t>
       </w:r>
       <w:r>
         <w:rPr>
@@ -957,7 +949,6 @@
         </w:rPr>
         <w:t>ck</w:t>
       </w:r>
-      <w:proofErr w:type="spellEnd"/>
       <w:r>
         <w:rPr>
           <w:sz w:val="22"/>
@@ -1986,15 +1977,7 @@
           <w:sz w:val="22"/>
           <w:szCs w:val="22"/>
         </w:rPr>
-        <w:t xml:space="preserve"> a Windows, </w:t>
-      </w:r>
-      <w:proofErr w:type="spellStart"/>
-      <w:r>
-        <w:rPr>
-          <w:sz w:val="22"/>
-          <w:szCs w:val="22"/>
-        </w:rPr>
-        <w:t>Mac</w:t>
+        <w:t xml:space="preserve"> a Windows, Mac</w:t>
       </w:r>
       <w:r>
         <w:rPr>
@@ -2003,7 +1986,6 @@
         </w:rPr>
         <w:t>OS</w:t>
       </w:r>
-      <w:proofErr w:type="spellEnd"/>
       <w:r>
         <w:rPr>
           <w:sz w:val="22"/>
@@ -2621,7 +2603,6 @@
           <w:sz w:val="22"/>
           <w:szCs w:val="22"/>
         </w:rPr>
-        <w:lastRenderedPageBreak/>
         <w:t>Lab</w:t>
       </w:r>
       <w:r>
@@ -3906,15 +3887,7 @@
           <w:sz w:val="22"/>
           <w:szCs w:val="22"/>
         </w:rPr>
-        <w:t xml:space="preserve">work must </w:t>
-      </w:r>
-      <w:r>
-        <w:rPr>
-          <w:sz w:val="22"/>
-          <w:szCs w:val="22"/>
-        </w:rPr>
-        <w:lastRenderedPageBreak/>
-        <w:t>still be your own.</w:t>
+        <w:t>work must still be your own.</w:t>
       </w:r>
       <w:r>
         <w:rPr>
@@ -4595,7 +4568,6 @@
           <w:sz w:val="24"/>
           <w:szCs w:val="24"/>
         </w:rPr>
-        <w:lastRenderedPageBreak/>
         <w:t>Help Room</w:t>
       </w:r>
     </w:p>

</xml_diff>